<commit_message>
docs: embed teammate final trello scrum captures and build complete deliverable docx
</commit_message>
<xml_diff>
--- a/docs/ENTREGA_FINAL_TP_SCRUM_2026_CHAMBI_FLORES_TEJEDA.docx
+++ b/docs/ENTREGA_FINAL_TP_SCRUM_2026_CHAMBI_FLORES_TEJEDA.docx
@@ -19742,7 +19742,7 @@
               <w:spacing w:before="60" w:after="60"/>
             </w:pPr>
             <w:r>
-              <w:t>Mitigado (No materializado). Volumen persistió los datos.</w:t>
+              <w:t>Mitigado (No materializado). El volumen persistió los datos.</w:t>
             </w:r>
           </w:p>
         </w:tc>
@@ -20695,7 +20695,7 @@
               <w:spacing w:before="60" w:after="60"/>
             </w:pPr>
             <w:r>
-              <w:t>tablero_github_projects.png</w:t>
+              <w:t>trello_tablero_inicial.png</w:t>
             </w:r>
           </w:p>
         </w:tc>
@@ -20721,7 +20721,7 @@
               <w:spacing w:before="60" w:after="60"/>
             </w:pPr>
             <w:r>
-              <w:t>Flujo de 5 columnas y 15 historias cargadas.</w:t>
+              <w:t>Configuración de las 5 columnas del flujo de valor.</w:t>
             </w:r>
           </w:p>
         </w:tc>
@@ -20749,7 +20749,7 @@
               <w:spacing w:before="60" w:after="60"/>
             </w:pPr>
             <w:r>
-              <w:t>tablero_trello.png</w:t>
+              <w:t>trello_sprint1_done.png</w:t>
             </w:r>
           </w:p>
         </w:tc>
@@ -20762,7 +20762,7 @@
               <w:spacing w:before="60" w:after="60"/>
             </w:pPr>
             <w:r>
-              <w:t>Sección 2.2</w:t>
+              <w:t>Sección 2.2 / 8.1</w:t>
             </w:r>
           </w:p>
         </w:tc>
@@ -20775,7 +20775,7 @@
               <w:spacing w:before="60" w:after="60"/>
             </w:pPr>
             <w:r>
-              <w:t>Radiador visual Kanban en Trello.</w:t>
+              <w:t>Historias del Sprint 1 finalizadas en estado Done.</w:t>
             </w:r>
           </w:p>
         </w:tc>
@@ -20803,7 +20803,7 @@
               <w:spacing w:before="60" w:after="60"/>
             </w:pPr>
             <w:r>
-              <w:t>arquitectura_docker.png</w:t>
+              <w:t>pipeline_github_actions.png</w:t>
             </w:r>
           </w:p>
         </w:tc>
@@ -20816,7 +20816,7 @@
               <w:spacing w:before="60" w:after="60"/>
             </w:pPr>
             <w:r>
-              <w:t>Sección 3.0</w:t>
+              <w:t>Sección 7.3</w:t>
             </w:r>
           </w:p>
         </w:tc>
@@ -20829,7 +20829,7 @@
               <w:spacing w:before="60" w:after="60"/>
             </w:pPr>
             <w:r>
-              <w:t>Arquitectura multicapa y red internal: true.</w:t>
+              <w:t>Ejecución exitosa del pipeline de CI (Exit code 0).</w:t>
             </w:r>
           </w:p>
         </w:tc>
@@ -20857,7 +20857,7 @@
               <w:spacing w:before="60" w:after="60"/>
             </w:pPr>
             <w:r>
-              <w:t>workflow_n8n_canvas.png</w:t>
+              <w:t>workflow_n8n_canvas.svg</w:t>
             </w:r>
           </w:p>
         </w:tc>
@@ -20911,7 +20911,7 @@
               <w:spacing w:before="60" w:after="60"/>
             </w:pPr>
             <w:r>
-              <w:t>burndown_chart.png</w:t>
+              <w:t>burndown_chart.svg</w:t>
             </w:r>
           </w:p>
         </w:tc>
@@ -20965,7 +20965,7 @@
               <w:spacing w:before="60" w:after="60"/>
             </w:pPr>
             <w:r>
-              <w:t>evidencia_terminal_seguridad.png</w:t>
+              <w:t>evidencia_terminal_seguridad.svg</w:t>
             </w:r>
           </w:p>
         </w:tc>
@@ -21006,7 +21006,7 @@
               <w:spacing w:before="60" w:after="60"/>
             </w:pPr>
             <w:r>
-              <w:t>Figura 7.2</w:t>
+              <w:t>Figura 8.1</w:t>
             </w:r>
           </w:p>
         </w:tc>
@@ -21019,7 +21019,7 @@
               <w:spacing w:before="60" w:after="60"/>
             </w:pPr>
             <w:r>
-              <w:t>pipeline_github_actions.png</w:t>
+              <w:t>retrospectiva_4ls.svg</w:t>
             </w:r>
           </w:p>
         </w:tc>
@@ -21032,7 +21032,7 @@
               <w:spacing w:before="60" w:after="60"/>
             </w:pPr>
             <w:r>
-              <w:t>Sección 7.3</w:t>
+              <w:t>Sección 8.2</w:t>
             </w:r>
           </w:p>
         </w:tc>
@@ -21045,7 +21045,7 @@
               <w:spacing w:before="60" w:after="60"/>
             </w:pPr>
             <w:r>
-              <w:t>Pipeline de CI exitoso (Exit code 0).</w:t>
+              <w:t>Dinámica 4Ls y compromisos de mejora.</w:t>
             </w:r>
           </w:p>
         </w:tc>
@@ -21057,12 +21057,12 @@
         <w:spacing w:before="280" w:after="120"/>
       </w:pPr>
       <w:r>
-        <w:t>GALERÍA DE EVIDENCIAS TÉCNICAS Y CAPTURAS REALES</w:t>
-      </w:r>
-    </w:p>
-    <w:p>
-      <w:r>
-        <w:t>Evidencia de Integración Continua (GitHub Actions):</w:t>
+        <w:t>GALERÍA DE EVIDENCIAS TÉCNICAS Y CAPTURAS DEL TABLERO SCRUM</w:t>
+      </w:r>
+    </w:p>
+    <w:p>
+      <w:r>
+        <w:t>1. Configuración Inicial del Tablero Kanban en Trello (5 Columnas):</w:t>
       </w:r>
     </w:p>
     <w:p>
@@ -21074,8 +21074,122 @@
       <w:r>
         <w:drawing>
           <wp:inline>
-            <wp:extent cx="5486400" cy="2057400"/>
+            <wp:extent cx="5669280" cy="2514093"/>
             <wp:docPr id="8" name="Picture 8"/>
+            <wp:cNvGraphicFramePr>
+              <a:graphicFrameLocks noChangeAspect="1"/>
+            </wp:cNvGraphicFramePr>
+            <a:graphic>
+              <a:graphicData uri="http://schemas.openxmlformats.org/drawingml/2006/picture">
+                <pic:pic>
+                  <pic:nvPicPr>
+                    <pic:cNvPr id="0" name="image1.png"/>
+                    <pic:cNvPicPr/>
+                  </pic:nvPicPr>
+                  <pic:blipFill>
+                    <a:blip r:embed="rId13"/>
+                    <a:stretch>
+                      <a:fillRect/>
+                    </a:stretch>
+                  </pic:blipFill>
+                  <pic:spPr>
+                    <a:xfrm>
+                      <a:off x="0" y="0"/>
+                      <a:ext cx="5669280" cy="2514093"/>
+                    </a:xfrm>
+                    <a:prstGeom prst="rect"/>
+                  </pic:spPr>
+                </pic:pic>
+              </a:graphicData>
+            </a:graphic>
+          </wp:inline>
+        </w:drawing>
+      </w:r>
+    </w:p>
+    <w:p>
+      <w:pPr>
+        <w:jc w:val="center"/>
+      </w:pPr>
+      <w:r>
+        <w:rPr>
+          <w:i/>
+        </w:rPr>
+        <w:t>Figura 2.1: Estructuración del tablero en Trello con el flujo de 5 columnas: Backlog, To Do, In Progress, Review y Done.</w:t>
+      </w:r>
+    </w:p>
+    <w:p>
+      <w:r>
+        <w:t>2. Tablero de Trello tras la Finalización del Sprint (Tarjetas en Done y Backlog):</w:t>
+      </w:r>
+    </w:p>
+    <w:p>
+      <w:pPr>
+        <w:jc w:val="center"/>
+      </w:pPr>
+    </w:p>
+    <w:p>
+      <w:r>
+        <w:drawing>
+          <wp:inline>
+            <wp:extent cx="5669280" cy="2455991"/>
+            <wp:docPr id="9" name="Picture 9"/>
+            <wp:cNvGraphicFramePr>
+              <a:graphicFrameLocks noChangeAspect="1"/>
+            </wp:cNvGraphicFramePr>
+            <a:graphic>
+              <a:graphicData uri="http://schemas.openxmlformats.org/drawingml/2006/picture">
+                <pic:pic>
+                  <pic:nvPicPr>
+                    <pic:cNvPr id="0" name="image11.png"/>
+                    <pic:cNvPicPr/>
+                  </pic:nvPicPr>
+                  <pic:blipFill>
+                    <a:blip r:embed="rId14"/>
+                    <a:stretch>
+                      <a:fillRect/>
+                    </a:stretch>
+                  </pic:blipFill>
+                  <pic:spPr>
+                    <a:xfrm>
+                      <a:off x="0" y="0"/>
+                      <a:ext cx="5669280" cy="2455991"/>
+                    </a:xfrm>
+                    <a:prstGeom prst="rect"/>
+                  </pic:spPr>
+                </pic:pic>
+              </a:graphicData>
+            </a:graphic>
+          </wp:inline>
+        </w:drawing>
+      </w:r>
+    </w:p>
+    <w:p>
+      <w:pPr>
+        <w:jc w:val="center"/>
+      </w:pPr>
+      <w:r>
+        <w:rPr>
+          <w:i/>
+        </w:rPr>
+        <w:t>Figura 2.2: Estado del tablero al cierre de la iteración: historias completadas en Done y HU-16 cancelada en Backlog.</w:t>
+      </w:r>
+    </w:p>
+    <w:p>
+      <w:r>
+        <w:t>3. Validación de CI/CD en GitHub Actions (Pipeline Exitoso):</w:t>
+      </w:r>
+    </w:p>
+    <w:p>
+      <w:pPr>
+        <w:jc w:val="center"/>
+      </w:pPr>
+    </w:p>
+    <w:p>
+      <w:r>
+        <w:drawing>
+          <wp:inline>
+            <wp:extent cx="5669280" cy="2125980"/>
+            <wp:docPr id="10" name="Picture 10"/>
             <wp:cNvGraphicFramePr>
               <a:graphicFrameLocks noChangeAspect="1"/>
             </wp:cNvGraphicFramePr>
@@ -21095,7 +21209,7 @@
                   <pic:spPr>
                     <a:xfrm>
                       <a:off x="0" y="0"/>
-                      <a:ext cx="5486400" cy="2057400"/>
+                      <a:ext cx="5669280" cy="2125980"/>
                     </a:xfrm>
                     <a:prstGeom prst="rect"/>
                   </pic:spPr>
@@ -21115,63 +21229,6 @@
           <w:i/>
         </w:rPr>
         <w:t>Figura 7.2: Pipeline de CI en GitHub Actions ejecutando la validación estática de Docker Compose y linters con resultado exitoso (Exit code 0).</w:t>
-      </w:r>
-    </w:p>
-    <w:p>
-      <w:r>
-        <w:t>Evidencia del Tablero Kanban en Trello (Sprint 1 Finalizado):</w:t>
-      </w:r>
-    </w:p>
-    <w:p>
-      <w:pPr>
-        <w:jc w:val="center"/>
-      </w:pPr>
-    </w:p>
-    <w:p>
-      <w:r>
-        <w:drawing>
-          <wp:inline>
-            <wp:extent cx="5486400" cy="2376765"/>
-            <wp:docPr id="9" name="Picture 9"/>
-            <wp:cNvGraphicFramePr>
-              <a:graphicFrameLocks noChangeAspect="1"/>
-            </wp:cNvGraphicFramePr>
-            <a:graphic>
-              <a:graphicData uri="http://schemas.openxmlformats.org/drawingml/2006/picture">
-                <pic:pic>
-                  <pic:nvPicPr>
-                    <pic:cNvPr id="0" name="image11.png"/>
-                    <pic:cNvPicPr/>
-                  </pic:nvPicPr>
-                  <pic:blipFill>
-                    <a:blip r:embed="rId13"/>
-                    <a:stretch>
-                      <a:fillRect/>
-                    </a:stretch>
-                  </pic:blipFill>
-                  <pic:spPr>
-                    <a:xfrm>
-                      <a:off x="0" y="0"/>
-                      <a:ext cx="5486400" cy="2376765"/>
-                    </a:xfrm>
-                    <a:prstGeom prst="rect"/>
-                  </pic:spPr>
-                </pic:pic>
-              </a:graphicData>
-            </a:graphic>
-          </wp:inline>
-        </w:drawing>
-      </w:r>
-    </w:p>
-    <w:p>
-      <w:pPr>
-        <w:jc w:val="center"/>
-      </w:pPr>
-      <w:r>
-        <w:rPr>
-          <w:i/>
-        </w:rPr>
-        <w:t>Figura 2.2: Tablero de Trello con historias del Sprint 1 en estado Done y backlog priorizado.</w:t>
       </w:r>
     </w:p>
     <w:sectPr>

</xml_diff>